<commit_message>
feat: initialize project structure with backend, frontend, database, and dataset modules
</commit_message>
<xml_diff>
--- a/docs/ai-disclosure.docx
+++ b/docs/ai-disclosure.docx
@@ -5,13 +5,13 @@
     <w:p>
       <w:pPr>
         <w:pStyle w:val="Heading1"/>
-        <w:spacing w:before="240" w:after="120"/>
+        <w:spacing w:before="320" w:after="160"/>
       </w:pPr>
       <w:r>
         <w:rPr>
-          <w:rFonts w:ascii="Times New Roman" w:hAnsi="Times New Roman"/>
+          <w:rFonts w:ascii="Segoe UI" w:hAnsi="Segoe UI"/>
           <w:b/>
-          <w:color w:val="0F172A"/>
+          <w:color w:val="1E3A8A"/>
           <w:sz w:val="36"/>
         </w:rPr>
         <w:t>BẢN CÔNG BỐ SỬ DỤNG TRÍ TUỆ NHÂN TẠO (AI DISCLOSURE STATEMENT)</w:t>
@@ -19,41 +19,30 @@
     </w:p>
     <w:p>
       <w:pPr>
-        <w:spacing w:after="100" w:before="0" w:line="276" w:lineRule="auto"/>
+        <w:spacing w:before="40" w:after="80" w:line="288" w:lineRule="auto"/>
       </w:pPr>
       <w:r>
         <w:rPr>
-          <w:rFonts w:ascii="Times New Roman" w:hAnsi="Times New Roman"/>
           <w:b/>
-          <w:sz w:val="22"/>
         </w:rPr>
         <w:t>Trường Đại học Văn Lang — Khoa Công nghệ Thông tin</w:t>
-      </w:r>
-      <w:r>
-        <w:rPr>
-          <w:rFonts w:ascii="Times New Roman" w:hAnsi="Times New Roman"/>
-          <w:sz w:val="22"/>
-        </w:rPr>
-        <w:t xml:space="preserve">  </w:t>
       </w:r>
     </w:p>
     <w:p>
       <w:pPr>
         <w:pStyle w:val="ListBullet"/>
-        <w:spacing w:after="60" w:before="0"/>
+        <w:spacing w:before="40" w:after="40" w:line="276" w:lineRule="auto"/>
       </w:pPr>
       <w:r>
         <w:rPr>
-          <w:rFonts w:ascii="Times New Roman" w:hAnsi="Times New Roman"/>
           <w:b/>
-          <w:sz w:val="22"/>
         </w:rPr>
         <w:t>Học phần:</w:t>
       </w:r>
       <w:r>
         <w:rPr>
-          <w:rFonts w:ascii="Times New Roman" w:hAnsi="Times New Roman"/>
-          <w:sz w:val="22"/>
+          <w:rFonts w:ascii="Segoe UI" w:hAnsi="Segoe UI"/>
+          <w:sz w:val="20"/>
         </w:rPr>
         <w:t xml:space="preserve"> Chuyên đề tốt nghiệp 2 (Học kỳ 1, Năm học 2026 – 2027)</w:t>
       </w:r>
@@ -61,20 +50,18 @@
     <w:p>
       <w:pPr>
         <w:pStyle w:val="ListBullet"/>
-        <w:spacing w:after="60" w:before="0"/>
+        <w:spacing w:before="40" w:after="40" w:line="276" w:lineRule="auto"/>
       </w:pPr>
       <w:r>
         <w:rPr>
-          <w:rFonts w:ascii="Times New Roman" w:hAnsi="Times New Roman"/>
           <w:b/>
-          <w:sz w:val="22"/>
         </w:rPr>
         <w:t>Nhóm thực hiện:</w:t>
       </w:r>
       <w:r>
         <w:rPr>
-          <w:rFonts w:ascii="Times New Roman" w:hAnsi="Times New Roman"/>
-          <w:sz w:val="22"/>
+          <w:rFonts w:ascii="Segoe UI" w:hAnsi="Segoe UI"/>
+          <w:sz w:val="20"/>
         </w:rPr>
         <w:t xml:space="preserve"> Nhóm 8 (261_71ITGR40303_04)</w:t>
       </w:r>
@@ -82,20 +69,18 @@
     <w:p>
       <w:pPr>
         <w:pStyle w:val="ListBullet"/>
-        <w:spacing w:after="60" w:before="0"/>
+        <w:spacing w:before="40" w:after="40" w:line="276" w:lineRule="auto"/>
       </w:pPr>
       <w:r>
         <w:rPr>
-          <w:rFonts w:ascii="Times New Roman" w:hAnsi="Times New Roman"/>
           <w:b/>
-          <w:sz w:val="22"/>
         </w:rPr>
         <w:t>Tên đề tài:</w:t>
       </w:r>
       <w:r>
         <w:rPr>
-          <w:rFonts w:ascii="Times New Roman" w:hAnsi="Times New Roman"/>
-          <w:sz w:val="22"/>
+          <w:rFonts w:ascii="Segoe UI" w:hAnsi="Segoe UI"/>
+          <w:sz w:val="20"/>
         </w:rPr>
         <w:t xml:space="preserve"> Nền tảng quản lý freelance &amp; marketplace việc làm part-time cho sinh viên</w:t>
       </w:r>
@@ -103,45 +88,40 @@
     <w:p>
       <w:pPr>
         <w:pStyle w:val="ListBullet"/>
-        <w:spacing w:after="60" w:before="0"/>
+        <w:spacing w:before="40" w:after="40" w:line="276" w:lineRule="auto"/>
       </w:pPr>
       <w:r>
         <w:rPr>
-          <w:rFonts w:ascii="Times New Roman" w:hAnsi="Times New Roman"/>
           <w:b/>
-          <w:sz w:val="22"/>
         </w:rPr>
         <w:t>Giảng viên hướng dẫn:</w:t>
       </w:r>
       <w:r>
         <w:rPr>
-          <w:rFonts w:ascii="Times New Roman" w:hAnsi="Times New Roman"/>
-          <w:sz w:val="22"/>
+          <w:rFonts w:ascii="Segoe UI" w:hAnsi="Segoe UI"/>
+          <w:sz w:val="20"/>
         </w:rPr>
         <w:t xml:space="preserve"> ThS. Nguyễn Văn Trung</w:t>
       </w:r>
     </w:p>
     <w:p>
       <w:pPr>
-        <w:spacing w:after="120" w:before="120"/>
+        <w:spacing w:before="120" w:after="120"/>
+        <w:pBdr>
+          <w:bottom w:val="single" w:sz="12" w:space="1" w:color="CBD5E1"/>
+        </w:pBdr>
       </w:pPr>
-      <w:r>
-        <w:rPr>
-          <w:color w:val="C8CDD7"/>
-        </w:rPr>
-        <w:t>—————————————————————————————————————————————</w:t>
-      </w:r>
     </w:p>
     <w:p>
       <w:pPr>
         <w:pStyle w:val="Heading2"/>
-        <w:spacing w:before="200" w:after="80"/>
+        <w:spacing w:before="280" w:after="120"/>
       </w:pPr>
       <w:r>
         <w:rPr>
-          <w:rFonts w:ascii="Times New Roman" w:hAnsi="Times New Roman"/>
+          <w:rFonts w:ascii="Segoe UI" w:hAnsi="Segoe UI"/>
           <w:b/>
-          <w:color w:val="1E3A8A"/>
+          <w:color w:val="4F46E5"/>
           <w:sz w:val="28"/>
         </w:rPr>
         <w:t>1. MỤC ĐÍCH VĂN BẢN</w:t>
@@ -149,37 +129,34 @@
     </w:p>
     <w:p>
       <w:pPr>
-        <w:spacing w:after="100" w:before="0" w:line="276" w:lineRule="auto"/>
+        <w:spacing w:before="40" w:after="80" w:line="288" w:lineRule="auto"/>
       </w:pPr>
       <w:r>
         <w:rPr>
-          <w:rFonts w:ascii="Times New Roman" w:hAnsi="Times New Roman"/>
-          <w:sz w:val="22"/>
+          <w:rFonts w:ascii="Segoe UI" w:hAnsi="Segoe UI"/>
+          <w:sz w:val="21"/>
         </w:rPr>
         <w:t>Tuân thủ quy định về liêm chính học thuật và định hướng ứng dụng công nghệ có trách nhiệm của Trường Đại học Văn Lang, Nhóm 8 công bố minh bạch phạm vi, mức độ và mục đích sử dụng các công cụ Trí tuệ nhân tạo (AI) trong quá trình nghiên cứu, xây dựng và hoàn thiện đồ án.</w:t>
       </w:r>
     </w:p>
     <w:p>
       <w:pPr>
-        <w:spacing w:after="120" w:before="120"/>
+        <w:spacing w:before="120" w:after="120"/>
+        <w:pBdr>
+          <w:bottom w:val="single" w:sz="12" w:space="1" w:color="CBD5E1"/>
+        </w:pBdr>
       </w:pPr>
-      <w:r>
-        <w:rPr>
-          <w:color w:val="C8CDD7"/>
-        </w:rPr>
-        <w:t>—————————————————————————————————————————————</w:t>
-      </w:r>
     </w:p>
     <w:p>
       <w:pPr>
         <w:pStyle w:val="Heading2"/>
-        <w:spacing w:before="200" w:after="80"/>
+        <w:spacing w:before="280" w:after="120"/>
       </w:pPr>
       <w:r>
         <w:rPr>
-          <w:rFonts w:ascii="Times New Roman" w:hAnsi="Times New Roman"/>
+          <w:rFonts w:ascii="Segoe UI" w:hAnsi="Segoe UI"/>
           <w:b/>
-          <w:color w:val="1E3A8A"/>
+          <w:color w:val="4F46E5"/>
           <w:sz w:val="28"/>
         </w:rPr>
         <w:t>2. CÁC CÔNG CỤ AI ĐÃ THAM KHẢO VÀ SỬ DỤNG</w:t>
@@ -187,67 +164,74 @@
     </w:p>
     <w:p>
       <w:pPr>
-        <w:pStyle w:val="ListNumber"/>
-        <w:spacing w:after="60" w:before="0"/>
+        <w:spacing w:before="40" w:after="40" w:line="276" w:lineRule="auto"/>
+        <w:ind w:left="360"/>
       </w:pPr>
       <w:r>
         <w:rPr>
-          <w:rFonts w:ascii="Times New Roman" w:hAnsi="Times New Roman"/>
+          <w:rFonts w:ascii="Segoe UI" w:hAnsi="Segoe UI"/>
+          <w:sz w:val="20"/>
+        </w:rPr>
+        <w:t xml:space="preserve">1. </w:t>
+      </w:r>
+      <w:r>
+        <w:rPr>
           <w:b/>
-          <w:sz w:val="22"/>
         </w:rPr>
         <w:t>Google Gemini / Antigravity Assistant:</w:t>
       </w:r>
       <w:r>
         <w:rPr>
-          <w:rFonts w:ascii="Times New Roman" w:hAnsi="Times New Roman"/>
-          <w:sz w:val="22"/>
+          <w:rFonts w:ascii="Segoe UI" w:hAnsi="Segoe UI"/>
+          <w:sz w:val="20"/>
         </w:rPr>
         <w:t xml:space="preserve"> Hỗ trợ rà soát cấu trúc mã nguồn, định dạng tài liệu kỹ thuật theo chuẩn Markdown/OpenAPI, và gợi ý ca kiểm thử biên (Edge Cases).</w:t>
       </w:r>
     </w:p>
     <w:p>
       <w:pPr>
-        <w:pStyle w:val="ListNumber"/>
-        <w:spacing w:after="60" w:before="0"/>
+        <w:spacing w:before="40" w:after="40" w:line="276" w:lineRule="auto"/>
+        <w:ind w:left="360"/>
       </w:pPr>
       <w:r>
         <w:rPr>
-          <w:rFonts w:ascii="Times New Roman" w:hAnsi="Times New Roman"/>
+          <w:rFonts w:ascii="Segoe UI" w:hAnsi="Segoe UI"/>
+          <w:sz w:val="20"/>
+        </w:rPr>
+        <w:t xml:space="preserve">2. </w:t>
+      </w:r>
+      <w:r>
+        <w:rPr>
           <w:b/>
-          <w:sz w:val="22"/>
         </w:rPr>
         <w:t>GitHub Copilot:</w:t>
       </w:r>
       <w:r>
         <w:rPr>
-          <w:rFonts w:ascii="Times New Roman" w:hAnsi="Times New Roman"/>
-          <w:sz w:val="22"/>
+          <w:rFonts w:ascii="Segoe UI" w:hAnsi="Segoe UI"/>
+          <w:sz w:val="20"/>
         </w:rPr>
         <w:t xml:space="preserve"> Hỗ trợ gợi ý cú pháp mã nguồn lặp lại (Boilerplate code) cho DTOs, Repository interfaces và TypeScript type definitions.</w:t>
       </w:r>
     </w:p>
     <w:p>
       <w:pPr>
-        <w:spacing w:after="120" w:before="120"/>
+        <w:spacing w:before="120" w:after="120"/>
+        <w:pBdr>
+          <w:bottom w:val="single" w:sz="12" w:space="1" w:color="CBD5E1"/>
+        </w:pBdr>
       </w:pPr>
-      <w:r>
-        <w:rPr>
-          <w:color w:val="C8CDD7"/>
-        </w:rPr>
-        <w:t>—————————————————————————————————————————————</w:t>
-      </w:r>
     </w:p>
     <w:p>
       <w:pPr>
         <w:pStyle w:val="Heading2"/>
-        <w:spacing w:before="200" w:after="80"/>
+        <w:spacing w:before="280" w:after="120"/>
       </w:pPr>
       <w:r>
         <w:rPr>
-          <w:rFonts w:ascii="Times New Roman" w:hAnsi="Times New Roman"/>
+          <w:rFonts w:ascii="Segoe UI" w:hAnsi="Segoe UI"/>
           <w:b/>
-          <w:color w:val="1E3A8A"/>
+          <w:color w:val="4F46E5"/>
           <w:sz w:val="28"/>
         </w:rPr>
         <w:t>3. PHẠM VI ỨNG DỤNG VÀ PHÂN ĐỊNH TRÁCH NHIỆM</w:t>
@@ -255,8 +239,10 @@
     </w:p>
     <w:tbl>
       <w:tblPr>
+        <w:tblStyle w:val="TableGrid"/>
         <w:tblW w:type="auto" w:w="0"/>
         <w:jc w:val="center"/>
+        <w:tblLayout w:type="autofit"/>
         <w:tblLook w:firstColumn="1" w:firstRow="1" w:lastColumn="0" w:lastRow="0" w:noHBand="0" w:noVBand="1" w:val="04A0"/>
       </w:tblPr>
       <w:tblGrid>
@@ -268,25 +254,26 @@
         <w:tc>
           <w:tcPr>
             <w:tcW w:type="dxa" w:w="3120"/>
-            <w:shd w:fill="1E293B"/>
+            <w:shd w:fill="4F46E5"/>
             <w:tcMar>
-              <w:top w:w="120" w:type="dxa"/>
-              <w:bottom w:w="120" w:type="dxa"/>
-              <w:left w:w="150" w:type="dxa"/>
-              <w:right w:w="150" w:type="dxa"/>
+              <w:top w:w="140" w:type="dxa"/>
+              <w:bottom w:w="140" w:type="dxa"/>
+              <w:left w:w="180" w:type="dxa"/>
+              <w:right w:w="180" w:type="dxa"/>
             </w:tcMar>
+            <w:vAlign w:val="center"/>
           </w:tcPr>
           <w:p>
             <w:pPr>
-              <w:spacing w:after="40" w:before="40"/>
-              <w:jc w:val="center"/>
+              <w:spacing w:before="40" w:after="40"/>
+              <w:jc w:val="left"/>
             </w:pPr>
             <w:r>
               <w:rPr>
-                <w:rFonts w:ascii="Times New Roman" w:hAnsi="Times New Roman"/>
+                <w:rFonts w:ascii="Segoe UI" w:hAnsi="Segoe UI"/>
                 <w:b/>
                 <w:color w:val="FFFFFF"/>
-                <w:sz w:val="21"/>
+                <w:sz w:val="20"/>
               </w:rPr>
               <w:t>Hạng mục công việc</w:t>
             </w:r>
@@ -295,25 +282,26 @@
         <w:tc>
           <w:tcPr>
             <w:tcW w:type="dxa" w:w="3120"/>
-            <w:shd w:fill="1E293B"/>
+            <w:shd w:fill="4F46E5"/>
             <w:tcMar>
-              <w:top w:w="120" w:type="dxa"/>
-              <w:bottom w:w="120" w:type="dxa"/>
-              <w:left w:w="150" w:type="dxa"/>
-              <w:right w:w="150" w:type="dxa"/>
+              <w:top w:w="140" w:type="dxa"/>
+              <w:bottom w:w="140" w:type="dxa"/>
+              <w:left w:w="180" w:type="dxa"/>
+              <w:right w:w="180" w:type="dxa"/>
             </w:tcMar>
+            <w:vAlign w:val="center"/>
           </w:tcPr>
           <w:p>
             <w:pPr>
-              <w:spacing w:after="40" w:before="40"/>
-              <w:jc w:val="center"/>
+              <w:spacing w:before="40" w:after="40"/>
+              <w:jc w:val="left"/>
             </w:pPr>
             <w:r>
               <w:rPr>
-                <w:rFonts w:ascii="Times New Roman" w:hAnsi="Times New Roman"/>
+                <w:rFonts w:ascii="Segoe UI" w:hAnsi="Segoe UI"/>
                 <w:b/>
                 <w:color w:val="FFFFFF"/>
-                <w:sz w:val="21"/>
+                <w:sz w:val="20"/>
               </w:rPr>
               <w:t>Mức độ hỗ trợ của công cụ AI</w:t>
             </w:r>
@@ -322,25 +310,26 @@
         <w:tc>
           <w:tcPr>
             <w:tcW w:type="dxa" w:w="3120"/>
-            <w:shd w:fill="1E293B"/>
+            <w:shd w:fill="4F46E5"/>
             <w:tcMar>
-              <w:top w:w="120" w:type="dxa"/>
-              <w:bottom w:w="120" w:type="dxa"/>
-              <w:left w:w="150" w:type="dxa"/>
-              <w:right w:w="150" w:type="dxa"/>
+              <w:top w:w="140" w:type="dxa"/>
+              <w:bottom w:w="140" w:type="dxa"/>
+              <w:left w:w="180" w:type="dxa"/>
+              <w:right w:w="180" w:type="dxa"/>
             </w:tcMar>
+            <w:vAlign w:val="center"/>
           </w:tcPr>
           <w:p>
             <w:pPr>
-              <w:spacing w:after="40" w:before="40"/>
-              <w:jc w:val="center"/>
+              <w:spacing w:before="40" w:after="40"/>
+              <w:jc w:val="left"/>
             </w:pPr>
             <w:r>
               <w:rPr>
-                <w:rFonts w:ascii="Times New Roman" w:hAnsi="Times New Roman"/>
+                <w:rFonts w:ascii="Segoe UI" w:hAnsi="Segoe UI"/>
                 <w:b/>
                 <w:color w:val="FFFFFF"/>
-                <w:sz w:val="21"/>
+                <w:sz w:val="20"/>
               </w:rPr>
               <w:t>Trách nhiệm và kiểm soát của Nhóm 8</w:t>
             </w:r>
@@ -353,21 +342,20 @@
             <w:tcW w:type="dxa" w:w="3120"/>
             <w:shd w:fill="FFFFFF"/>
             <w:tcMar>
-              <w:top w:w="100" w:type="dxa"/>
-              <w:bottom w:w="100" w:type="dxa"/>
-              <w:left w:w="120" w:type="dxa"/>
-              <w:right w:w="120" w:type="dxa"/>
+              <w:top w:w="120" w:type="dxa"/>
+              <w:bottom w:w="120" w:type="dxa"/>
+              <w:left w:w="160" w:type="dxa"/>
+              <w:right w:w="160" w:type="dxa"/>
             </w:tcMar>
+            <w:vAlign w:val="center"/>
           </w:tcPr>
           <w:p>
             <w:pPr>
-              <w:spacing w:after="40" w:before="40"/>
+              <w:spacing w:before="20" w:after="20" w:line="276" w:lineRule="auto"/>
             </w:pPr>
             <w:r>
               <w:rPr>
-                <w:rFonts w:ascii="Times New Roman" w:hAnsi="Times New Roman"/>
                 <w:b/>
-                <w:sz w:val="20"/>
               </w:rPr>
               <w:t>Khảo sát &amp; Phân tích yêu cầu (SRS)</w:t>
             </w:r>
@@ -378,20 +366,21 @@
             <w:tcW w:type="dxa" w:w="3120"/>
             <w:shd w:fill="FFFFFF"/>
             <w:tcMar>
-              <w:top w:w="100" w:type="dxa"/>
-              <w:bottom w:w="100" w:type="dxa"/>
-              <w:left w:w="120" w:type="dxa"/>
-              <w:right w:w="120" w:type="dxa"/>
+              <w:top w:w="120" w:type="dxa"/>
+              <w:bottom w:w="120" w:type="dxa"/>
+              <w:left w:w="160" w:type="dxa"/>
+              <w:right w:w="160" w:type="dxa"/>
             </w:tcMar>
+            <w:vAlign w:val="center"/>
           </w:tcPr>
           <w:p>
             <w:pPr>
-              <w:spacing w:after="40" w:before="40"/>
+              <w:spacing w:before="20" w:after="20" w:line="276" w:lineRule="auto"/>
             </w:pPr>
             <w:r>
               <w:rPr>
-                <w:rFonts w:ascii="Times New Roman" w:hAnsi="Times New Roman"/>
-                <w:sz w:val="20"/>
+                <w:rFonts w:ascii="Segoe UI" w:hAnsi="Segoe UI"/>
+                <w:sz w:val="19"/>
               </w:rPr>
               <w:t>Tham khảo mẫu cấu trúc tài liệu phần mềm IEEE 830.</w:t>
             </w:r>
@@ -402,20 +391,21 @@
             <w:tcW w:type="dxa" w:w="3120"/>
             <w:shd w:fill="FFFFFF"/>
             <w:tcMar>
-              <w:top w:w="100" w:type="dxa"/>
-              <w:bottom w:w="100" w:type="dxa"/>
-              <w:left w:w="120" w:type="dxa"/>
-              <w:right w:w="120" w:type="dxa"/>
+              <w:top w:w="120" w:type="dxa"/>
+              <w:bottom w:w="120" w:type="dxa"/>
+              <w:left w:w="160" w:type="dxa"/>
+              <w:right w:w="160" w:type="dxa"/>
             </w:tcMar>
+            <w:vAlign w:val="center"/>
           </w:tcPr>
           <w:p>
             <w:pPr>
-              <w:spacing w:after="40" w:before="40"/>
+              <w:spacing w:before="20" w:after="20" w:line="276" w:lineRule="auto"/>
             </w:pPr>
             <w:r>
               <w:rPr>
-                <w:rFonts w:ascii="Times New Roman" w:hAnsi="Times New Roman"/>
-                <w:sz w:val="20"/>
+                <w:rFonts w:ascii="Segoe UI" w:hAnsi="Segoe UI"/>
+                <w:sz w:val="19"/>
               </w:rPr>
               <w:t>Nhóm tự khảo sát thực tế nhu cầu việc làm sinh viên Văn Lang, tự xác định các tác nhân và 100% quy tắc nghiệp vụ (Business Rules).</w:t>
             </w:r>
@@ -428,21 +418,20 @@
             <w:tcW w:type="dxa" w:w="3120"/>
             <w:shd w:fill="F8FAFC"/>
             <w:tcMar>
-              <w:top w:w="100" w:type="dxa"/>
-              <w:bottom w:w="100" w:type="dxa"/>
-              <w:left w:w="120" w:type="dxa"/>
-              <w:right w:w="120" w:type="dxa"/>
+              <w:top w:w="120" w:type="dxa"/>
+              <w:bottom w:w="120" w:type="dxa"/>
+              <w:left w:w="160" w:type="dxa"/>
+              <w:right w:w="160" w:type="dxa"/>
             </w:tcMar>
+            <w:vAlign w:val="center"/>
           </w:tcPr>
           <w:p>
             <w:pPr>
-              <w:spacing w:after="40" w:before="40"/>
+              <w:spacing w:before="20" w:after="20" w:line="276" w:lineRule="auto"/>
             </w:pPr>
             <w:r>
               <w:rPr>
-                <w:rFonts w:ascii="Times New Roman" w:hAnsi="Times New Roman"/>
                 <w:b/>
-                <w:sz w:val="20"/>
               </w:rPr>
               <w:t>Thiết kế Kiến trúc &amp; Cơ sở dữ liệu (ERD)</w:t>
             </w:r>
@@ -453,20 +442,21 @@
             <w:tcW w:type="dxa" w:w="3120"/>
             <w:shd w:fill="F8FAFC"/>
             <w:tcMar>
-              <w:top w:w="100" w:type="dxa"/>
-              <w:bottom w:w="100" w:type="dxa"/>
-              <w:left w:w="120" w:type="dxa"/>
-              <w:right w:w="120" w:type="dxa"/>
+              <w:top w:w="120" w:type="dxa"/>
+              <w:bottom w:w="120" w:type="dxa"/>
+              <w:left w:w="160" w:type="dxa"/>
+              <w:right w:w="160" w:type="dxa"/>
             </w:tcMar>
+            <w:vAlign w:val="center"/>
           </w:tcPr>
           <w:p>
             <w:pPr>
-              <w:spacing w:after="40" w:before="40"/>
+              <w:spacing w:before="20" w:after="20" w:line="276" w:lineRule="auto"/>
             </w:pPr>
             <w:r>
               <w:rPr>
-                <w:rFonts w:ascii="Times New Roman" w:hAnsi="Times New Roman"/>
-                <w:sz w:val="20"/>
+                <w:rFonts w:ascii="Segoe UI" w:hAnsi="Segoe UI"/>
+                <w:sz w:val="19"/>
               </w:rPr>
               <w:t>Kiểm tra cú pháp SQL DDL và tính hợp lệ cú pháp DrawIO XML.</w:t>
             </w:r>
@@ -477,20 +467,21 @@
             <w:tcW w:type="dxa" w:w="3120"/>
             <w:shd w:fill="F8FAFC"/>
             <w:tcMar>
-              <w:top w:w="100" w:type="dxa"/>
-              <w:bottom w:w="100" w:type="dxa"/>
-              <w:left w:w="120" w:type="dxa"/>
-              <w:right w:w="120" w:type="dxa"/>
+              <w:top w:w="120" w:type="dxa"/>
+              <w:bottom w:w="120" w:type="dxa"/>
+              <w:left w:w="160" w:type="dxa"/>
+              <w:right w:w="160" w:type="dxa"/>
             </w:tcMar>
+            <w:vAlign w:val="center"/>
           </w:tcPr>
           <w:p>
             <w:pPr>
-              <w:spacing w:after="40" w:before="40"/>
+              <w:spacing w:before="20" w:after="20" w:line="276" w:lineRule="auto"/>
             </w:pPr>
             <w:r>
               <w:rPr>
-                <w:rFonts w:ascii="Times New Roman" w:hAnsi="Times New Roman"/>
-                <w:sz w:val="20"/>
+                <w:rFonts w:ascii="Segoe UI" w:hAnsi="Segoe UI"/>
+                <w:sz w:val="19"/>
               </w:rPr>
               <w:t>Nhóm tự thiết kế kiến trúc 3 lớp, chuẩn hóa dữ liệu 3NF, thiết lập ràng buộc khóa ngoại và chỉ mục hiệu năng.</w:t>
             </w:r>
@@ -503,21 +494,20 @@
             <w:tcW w:type="dxa" w:w="3120"/>
             <w:shd w:fill="FFFFFF"/>
             <w:tcMar>
-              <w:top w:w="100" w:type="dxa"/>
-              <w:bottom w:w="100" w:type="dxa"/>
-              <w:left w:w="120" w:type="dxa"/>
-              <w:right w:w="120" w:type="dxa"/>
+              <w:top w:w="120" w:type="dxa"/>
+              <w:bottom w:w="120" w:type="dxa"/>
+              <w:left w:w="160" w:type="dxa"/>
+              <w:right w:w="160" w:type="dxa"/>
             </w:tcMar>
+            <w:vAlign w:val="center"/>
           </w:tcPr>
           <w:p>
             <w:pPr>
-              <w:spacing w:after="40" w:before="40"/>
+              <w:spacing w:before="20" w:after="20" w:line="276" w:lineRule="auto"/>
             </w:pPr>
             <w:r>
               <w:rPr>
-                <w:rFonts w:ascii="Times New Roman" w:hAnsi="Times New Roman"/>
                 <w:b/>
-                <w:sz w:val="20"/>
               </w:rPr>
               <w:t>Lập trình Backend Spring Boot</w:t>
             </w:r>
@@ -528,20 +518,21 @@
             <w:tcW w:type="dxa" w:w="3120"/>
             <w:shd w:fill="FFFFFF"/>
             <w:tcMar>
-              <w:top w:w="100" w:type="dxa"/>
-              <w:bottom w:w="100" w:type="dxa"/>
-              <w:left w:w="120" w:type="dxa"/>
-              <w:right w:w="120" w:type="dxa"/>
+              <w:top w:w="120" w:type="dxa"/>
+              <w:bottom w:w="120" w:type="dxa"/>
+              <w:left w:w="160" w:type="dxa"/>
+              <w:right w:w="160" w:type="dxa"/>
             </w:tcMar>
+            <w:vAlign w:val="center"/>
           </w:tcPr>
           <w:p>
             <w:pPr>
-              <w:spacing w:after="40" w:before="40"/>
+              <w:spacing w:before="20" w:after="20" w:line="276" w:lineRule="auto"/>
             </w:pPr>
             <w:r>
               <w:rPr>
-                <w:rFonts w:ascii="Times New Roman" w:hAnsi="Times New Roman"/>
-                <w:sz w:val="20"/>
+                <w:rFonts w:ascii="Segoe UI" w:hAnsi="Segoe UI"/>
+                <w:sz w:val="19"/>
               </w:rPr>
               <w:t>Gợi ý cấu hình Spring Security SecurityFilterChain.</w:t>
             </w:r>
@@ -552,20 +543,21 @@
             <w:tcW w:type="dxa" w:w="3120"/>
             <w:shd w:fill="FFFFFF"/>
             <w:tcMar>
-              <w:top w:w="100" w:type="dxa"/>
-              <w:bottom w:w="100" w:type="dxa"/>
-              <w:left w:w="120" w:type="dxa"/>
-              <w:right w:w="120" w:type="dxa"/>
+              <w:top w:w="120" w:type="dxa"/>
+              <w:bottom w:w="120" w:type="dxa"/>
+              <w:left w:w="160" w:type="dxa"/>
+              <w:right w:w="160" w:type="dxa"/>
             </w:tcMar>
+            <w:vAlign w:val="center"/>
           </w:tcPr>
           <w:p>
             <w:pPr>
-              <w:spacing w:after="40" w:before="40"/>
+              <w:spacing w:before="20" w:after="20" w:line="276" w:lineRule="auto"/>
             </w:pPr>
             <w:r>
               <w:rPr>
-                <w:rFonts w:ascii="Times New Roman" w:hAnsi="Times New Roman"/>
-                <w:sz w:val="20"/>
+                <w:rFonts w:ascii="Segoe UI" w:hAnsi="Segoe UI"/>
+                <w:sz w:val="19"/>
               </w:rPr>
               <w:t>Nhóm tự viết toàn bộ logic nghiệp vụ (Services), xử lý ngoại lệ tập trung và kiểm soát tính toàn vẹn dữ liệu giao dịch.</w:t>
             </w:r>
@@ -578,21 +570,20 @@
             <w:tcW w:type="dxa" w:w="3120"/>
             <w:shd w:fill="F8FAFC"/>
             <w:tcMar>
-              <w:top w:w="100" w:type="dxa"/>
-              <w:bottom w:w="100" w:type="dxa"/>
-              <w:left w:w="120" w:type="dxa"/>
-              <w:right w:w="120" w:type="dxa"/>
+              <w:top w:w="120" w:type="dxa"/>
+              <w:bottom w:w="120" w:type="dxa"/>
+              <w:left w:w="160" w:type="dxa"/>
+              <w:right w:w="160" w:type="dxa"/>
             </w:tcMar>
+            <w:vAlign w:val="center"/>
           </w:tcPr>
           <w:p>
             <w:pPr>
-              <w:spacing w:after="40" w:before="40"/>
+              <w:spacing w:before="20" w:after="20" w:line="276" w:lineRule="auto"/>
             </w:pPr>
             <w:r>
               <w:rPr>
-                <w:rFonts w:ascii="Times New Roman" w:hAnsi="Times New Roman"/>
                 <w:b/>
-                <w:sz w:val="20"/>
               </w:rPr>
               <w:t>Lập trình Frontend ReactJS</w:t>
             </w:r>
@@ -603,20 +594,21 @@
             <w:tcW w:type="dxa" w:w="3120"/>
             <w:shd w:fill="F8FAFC"/>
             <w:tcMar>
-              <w:top w:w="100" w:type="dxa"/>
-              <w:bottom w:w="100" w:type="dxa"/>
-              <w:left w:w="120" w:type="dxa"/>
-              <w:right w:w="120" w:type="dxa"/>
+              <w:top w:w="120" w:type="dxa"/>
+              <w:bottom w:w="120" w:type="dxa"/>
+              <w:left w:w="160" w:type="dxa"/>
+              <w:right w:w="160" w:type="dxa"/>
             </w:tcMar>
+            <w:vAlign w:val="center"/>
           </w:tcPr>
           <w:p>
             <w:pPr>
-              <w:spacing w:after="40" w:before="40"/>
+              <w:spacing w:before="20" w:after="20" w:line="276" w:lineRule="auto"/>
             </w:pPr>
             <w:r>
               <w:rPr>
-                <w:rFonts w:ascii="Times New Roman" w:hAnsi="Times New Roman"/>
-                <w:sz w:val="20"/>
+                <w:rFonts w:ascii="Segoe UI" w:hAnsi="Segoe UI"/>
+                <w:sz w:val="19"/>
               </w:rPr>
               <w:t>Hỗ trợ cấu hình màu sắc CSS Tokens và Lucide Icons.</w:t>
             </w:r>
@@ -627,20 +619,21 @@
             <w:tcW w:type="dxa" w:w="3120"/>
             <w:shd w:fill="F8FAFC"/>
             <w:tcMar>
-              <w:top w:w="100" w:type="dxa"/>
-              <w:bottom w:w="100" w:type="dxa"/>
-              <w:left w:w="120" w:type="dxa"/>
-              <w:right w:w="120" w:type="dxa"/>
+              <w:top w:w="120" w:type="dxa"/>
+              <w:bottom w:w="120" w:type="dxa"/>
+              <w:left w:w="160" w:type="dxa"/>
+              <w:right w:w="160" w:type="dxa"/>
             </w:tcMar>
+            <w:vAlign w:val="center"/>
           </w:tcPr>
           <w:p>
             <w:pPr>
-              <w:spacing w:after="40" w:before="40"/>
+              <w:spacing w:before="20" w:after="20" w:line="276" w:lineRule="auto"/>
             </w:pPr>
             <w:r>
               <w:rPr>
-                <w:rFonts w:ascii="Times New Roman" w:hAnsi="Times New Roman"/>
-                <w:sz w:val="20"/>
+                <w:rFonts w:ascii="Segoe UI" w:hAnsi="Segoe UI"/>
+                <w:sz w:val="19"/>
               </w:rPr>
               <w:t>Nhóm tự xây dựng cây Component, thiết lập hệ thống Route Guard, quản lý trạng thái AuthContext và tích hợp Axios Interceptor.</w:t>
             </w:r>
@@ -653,21 +646,20 @@
             <w:tcW w:type="dxa" w:w="3120"/>
             <w:shd w:fill="FFFFFF"/>
             <w:tcMar>
-              <w:top w:w="100" w:type="dxa"/>
-              <w:bottom w:w="100" w:type="dxa"/>
-              <w:left w:w="120" w:type="dxa"/>
-              <w:right w:w="120" w:type="dxa"/>
+              <w:top w:w="120" w:type="dxa"/>
+              <w:bottom w:w="120" w:type="dxa"/>
+              <w:left w:w="160" w:type="dxa"/>
+              <w:right w:w="160" w:type="dxa"/>
             </w:tcMar>
+            <w:vAlign w:val="center"/>
           </w:tcPr>
           <w:p>
             <w:pPr>
-              <w:spacing w:after="40" w:before="40"/>
+              <w:spacing w:before="20" w:after="20" w:line="276" w:lineRule="auto"/>
             </w:pPr>
             <w:r>
               <w:rPr>
-                <w:rFonts w:ascii="Times New Roman" w:hAnsi="Times New Roman"/>
                 <w:b/>
-                <w:sz w:val="20"/>
               </w:rPr>
               <w:t>Kiểm thử phần mềm (Testing)</w:t>
             </w:r>
@@ -678,20 +670,21 @@
             <w:tcW w:type="dxa" w:w="3120"/>
             <w:shd w:fill="FFFFFF"/>
             <w:tcMar>
-              <w:top w:w="100" w:type="dxa"/>
-              <w:bottom w:w="100" w:type="dxa"/>
-              <w:left w:w="120" w:type="dxa"/>
-              <w:right w:w="120" w:type="dxa"/>
+              <w:top w:w="120" w:type="dxa"/>
+              <w:bottom w:w="120" w:type="dxa"/>
+              <w:left w:w="160" w:type="dxa"/>
+              <w:right w:w="160" w:type="dxa"/>
             </w:tcMar>
+            <w:vAlign w:val="center"/>
           </w:tcPr>
           <w:p>
             <w:pPr>
-              <w:spacing w:after="40" w:before="40"/>
+              <w:spacing w:before="20" w:after="20" w:line="276" w:lineRule="auto"/>
             </w:pPr>
             <w:r>
               <w:rPr>
-                <w:rFonts w:ascii="Times New Roman" w:hAnsi="Times New Roman"/>
-                <w:sz w:val="20"/>
+                <w:rFonts w:ascii="Segoe UI" w:hAnsi="Segoe UI"/>
+                <w:sz w:val="19"/>
               </w:rPr>
               <w:t>Gợi ý các kịch bản kiểm thử phủ định (Negative Test Cases).</w:t>
             </w:r>
@@ -702,20 +695,21 @@
             <w:tcW w:type="dxa" w:w="3120"/>
             <w:shd w:fill="FFFFFF"/>
             <w:tcMar>
-              <w:top w:w="100" w:type="dxa"/>
-              <w:bottom w:w="100" w:type="dxa"/>
-              <w:left w:w="120" w:type="dxa"/>
-              <w:right w:w="120" w:type="dxa"/>
+              <w:top w:w="120" w:type="dxa"/>
+              <w:bottom w:w="120" w:type="dxa"/>
+              <w:left w:w="160" w:type="dxa"/>
+              <w:right w:w="160" w:type="dxa"/>
             </w:tcMar>
+            <w:vAlign w:val="center"/>
           </w:tcPr>
           <w:p>
             <w:pPr>
-              <w:spacing w:after="40" w:before="40"/>
+              <w:spacing w:before="20" w:after="20" w:line="276" w:lineRule="auto"/>
             </w:pPr>
             <w:r>
               <w:rPr>
-                <w:rFonts w:ascii="Times New Roman" w:hAnsi="Times New Roman"/>
-                <w:sz w:val="20"/>
+                <w:rFonts w:ascii="Segoe UI" w:hAnsi="Segoe UI"/>
+                <w:sz w:val="19"/>
               </w:rPr>
               <w:t>Nhóm tự lập trình toàn bộ Unit Test (JUnit 5/Mockito), thiết lập Postman Collection và tự tay thực thi nghiệm thu 100% ca kiểm thử.</w:t>
             </w:r>
@@ -725,30 +719,27 @@
     </w:tbl>
     <w:p>
       <w:pPr>
-        <w:spacing w:after="120"/>
+        <w:spacing w:after="160"/>
       </w:pPr>
     </w:p>
     <w:p>
       <w:pPr>
-        <w:spacing w:after="120" w:before="120"/>
+        <w:spacing w:before="120" w:after="120"/>
+        <w:pBdr>
+          <w:bottom w:val="single" w:sz="12" w:space="1" w:color="CBD5E1"/>
+        </w:pBdr>
       </w:pPr>
-      <w:r>
-        <w:rPr>
-          <w:color w:val="C8CDD7"/>
-        </w:rPr>
-        <w:t>—————————————————————————————————————————————</w:t>
-      </w:r>
     </w:p>
     <w:p>
       <w:pPr>
         <w:pStyle w:val="Heading2"/>
-        <w:spacing w:before="200" w:after="80"/>
+        <w:spacing w:before="280" w:after="120"/>
       </w:pPr>
       <w:r>
         <w:rPr>
-          <w:rFonts w:ascii="Times New Roman" w:hAnsi="Times New Roman"/>
+          <w:rFonts w:ascii="Segoe UI" w:hAnsi="Segoe UI"/>
           <w:b/>
-          <w:color w:val="1E3A8A"/>
+          <w:color w:val="4F46E5"/>
           <w:sz w:val="28"/>
         </w:rPr>
         <w:t>4. CAM KẾT LIÊM CHÍNH HỌC THUẬT</w:t>
@@ -757,20 +748,18 @@
     <w:p>
       <w:pPr>
         <w:pStyle w:val="ListBullet"/>
-        <w:spacing w:after="60" w:before="0"/>
+        <w:spacing w:before="40" w:after="40" w:line="276" w:lineRule="auto"/>
       </w:pPr>
       <w:r>
         <w:rPr>
-          <w:rFonts w:ascii="Times New Roman" w:hAnsi="Times New Roman"/>
           <w:b/>
-          <w:sz w:val="22"/>
         </w:rPr>
         <w:t>Làm chủ công nghệ:</w:t>
       </w:r>
       <w:r>
         <w:rPr>
-          <w:rFonts w:ascii="Times New Roman" w:hAnsi="Times New Roman"/>
-          <w:sz w:val="22"/>
+          <w:rFonts w:ascii="Segoe UI" w:hAnsi="Segoe UI"/>
+          <w:sz w:val="20"/>
         </w:rPr>
         <w:t xml:space="preserve"> Toàn bộ thành viên Nhóm 8 nắm vững 100% kiến trúc, mã nguồn, cơ sở dữ liệu và quy trình nghiệp vụ của dự án.</w:t>
       </w:r>
@@ -778,20 +767,18 @@
     <w:p>
       <w:pPr>
         <w:pStyle w:val="ListBullet"/>
-        <w:spacing w:after="60" w:before="0"/>
+        <w:spacing w:before="40" w:after="40" w:line="276" w:lineRule="auto"/>
       </w:pPr>
       <w:r>
         <w:rPr>
-          <w:rFonts w:ascii="Times New Roman" w:hAnsi="Times New Roman"/>
           <w:b/>
-          <w:sz w:val="22"/>
         </w:rPr>
         <w:t>Không phụ thuộc:</w:t>
       </w:r>
       <w:r>
         <w:rPr>
-          <w:rFonts w:ascii="Times New Roman" w:hAnsi="Times New Roman"/>
-          <w:sz w:val="22"/>
+          <w:rFonts w:ascii="Segoe UI" w:hAnsi="Segoe UI"/>
+          <w:sz w:val="20"/>
         </w:rPr>
         <w:t xml:space="preserve"> Công cụ AI chỉ đóng vai trò trợ lý hỗ trợ tăng tốc độ định dạng và kiểm tra lỗi chính tả kỹ thuật; hoàn toàn không thay thế năng lực tư duy, thiết kế hệ thống và trách nhiệm của sinh viên.</w:t>
       </w:r>
@@ -799,20 +786,18 @@
     <w:p>
       <w:pPr>
         <w:pStyle w:val="ListBullet"/>
-        <w:spacing w:after="60" w:before="0"/>
+        <w:spacing w:before="40" w:after="40" w:line="276" w:lineRule="auto"/>
       </w:pPr>
       <w:r>
         <w:rPr>
-          <w:rFonts w:ascii="Times New Roman" w:hAnsi="Times New Roman"/>
           <w:b/>
-          <w:sz w:val="22"/>
         </w:rPr>
         <w:t>Tính chịu trách nhiệm:</w:t>
       </w:r>
       <w:r>
         <w:rPr>
-          <w:rFonts w:ascii="Times New Roman" w:hAnsi="Times New Roman"/>
-          <w:sz w:val="22"/>
+          <w:rFonts w:ascii="Segoe UI" w:hAnsi="Segoe UI"/>
+          <w:sz w:val="20"/>
         </w:rPr>
         <w:t xml:space="preserve"> Nhóm 8 cam kết chịu trách nhiệm toàn diện về tính độc bản, tính chính xác và bản quyền của sản phẩm trước Hội đồng đánh giá chuyên đề.</w:t>
       </w:r>
@@ -1190,6 +1175,11 @@
     <w:name w:val="Normal"/>
     <w:qFormat/>
     <w:rsid w:val="00FC693F"/>
+    <w:rPr>
+      <w:rFonts w:ascii="Segoe UI" w:hAnsi="Segoe UI"/>
+      <w:color w:val="1E293B"/>
+      <w:sz w:val="21"/>
+    </w:rPr>
   </w:style>
   <w:style w:type="paragraph" w:styleId="Header">
     <w:name w:val="header"/>

</xml_diff>